<commit_message>
Clarify Oct. 28 planning-sheet next steps
Replace the combined before-and-after feedback prompt with a concise next-steps, colleague-learning, and Friday-evidence question.
</commit_message>
<xml_diff>
--- a/assets/plc/2026-10-28_PD_Science_Literacy_Lesson_Planning_and_Reflection_Sheet.docx
+++ b/assets/plc/2026-10-28_PD_Science_Literacy_Lesson_Planning_and_Reflection_Sheet.docx
@@ -542,7 +542,7 @@
                 <w:color w:val="1F2933"/>
                 <w:sz w:val="21"/>
               </w:rPr>
-              <w:t>FEEDBACK PLAN + AFTER-LESSON REFLECTION</w:t>
+              <w:t>NEXT STEPS + FRIDAY EVIDENCE</w:t>
             </w:r>
           </w:p>
         </w:tc>
@@ -577,7 +577,7 @@
                 <w:color w:val="6B7280"/>
                 <w:sz w:val="19"/>
               </w:rPr>
-              <w:t>Before: What feedback prompt and revision action will students complete? After: What did student work or data show? What will you keep, adjust, or try next? What colleague idea will you adapt? What evidence will you bring Friday?</w:t>
+              <w:t>What will you keep, adjust, or try next? What colleague idea will you adapt? What evidence will you bring Friday?</w:t>
             </w:r>
           </w:p>
         </w:tc>

</xml_diff>